<commit_message>
fix(quick_report): eliminate blank pages after condition pages
- Strip trailing <w:sectPr> and <w:br> from merged condition docs
- Standardize pair card image headers to full verbose labels
- Consolidate cell XML helpers into shared src/quick_report/utils.py
- Bump version to v1.7.2
</commit_message>
<xml_diff>
--- a/templates/QUICK REPORT/SUBSTATION CONFIGURATION/MASTER_SUBSTATION_CONDITION.docx
+++ b/templates/QUICK REPORT/SUBSTATION CONFIGURATION/MASTER_SUBSTATION_CONDITION.docx
@@ -1,6 +1,6 @@
 
 <file path=word/document.xml><?xml version="1.0" encoding="utf-8"?>
-<w:document xmlns:wpc="http://schemas.microsoft.com/office/word/2010/wordprocessingCanvas" xmlns:cx="http://schemas.microsoft.com/office/drawing/2014/chartex" xmlns:cx1="http://schemas.microsoft.com/office/drawing/2015/9/8/chartex" xmlns:cx2="http://schemas.microsoft.com/office/drawing/2015/10/21/chartex" xmlns:cx3="http://schemas.microsoft.com/office/drawing/2016/5/9/chartex" xmlns:cx4="http://schemas.microsoft.com/office/drawing/2016/5/10/chartex" xmlns:cx5="http://schemas.microsoft.com/office/drawing/2016/5/11/chartex" xmlns:cx6="http://schemas.microsoft.com/office/drawing/2016/5/12/chartex" xmlns:cx7="http://schemas.microsoft.com/office/drawing/2016/5/13/chartex" xmlns:cx8="http://schemas.microsoft.com/office/drawing/2016/5/14/chartex" xmlns:mc="http://schemas.openxmlformats.org/markup-compatibility/2006" xmlns:aink="http://schemas.microsoft.com/office/drawing/2016/ink" xmlns:am3d="http://schemas.microsoft.com/office/drawing/2017/model3d" xmlns:o="urn:schemas-microsoft-com:office:office" xmlns:oel="http://schemas.microsoft.com/office/2019/extlst" xmlns:r="http://schemas.openxmlformats.org/officeDocument/2006/relationships" xmlns:m="http://schemas.openxmlformats.org/officeDocument/2006/math" xmlns:v="urn:schemas-microsoft-com:vml" xmlns:wp14="http://schemas.microsoft.com/office/word/2010/wordprocessingDrawing" xmlns:wp="http://schemas.openxmlformats.org/drawingml/2006/wordprocessingDrawing" xmlns:w10="urn:schemas-microsoft-com:office:word" xmlns:w="http://schemas.openxmlformats.org/wordprocessingml/2006/main" xmlns:w14="http://schemas.microsoft.com/office/word/2010/wordml" xmlns:w15="http://schemas.microsoft.com/office/word/2012/wordml" xmlns:w16cex="http://schemas.microsoft.com/office/word/2018/wordml/cex" xmlns:w16cid="http://schemas.microsoft.com/office/word/2016/wordml/cid" xmlns:w16="http://schemas.microsoft.com/office/word/2018/wordml" xmlns:w16du="http://schemas.microsoft.com/office/word/2023/wordml/word16du" xmlns:w16sdtdh="http://schemas.microsoft.com/office/word/2020/wordml/sdtdatahash" xmlns:w16sdtfl="http://schemas.microsoft.com/office/word/2024/wordml/sdtformatlock" xmlns:w16se="http://schemas.microsoft.com/office/word/2015/wordml/symex" xmlns:wpg="http://schemas.microsoft.com/office/word/2010/wordprocessingGroup" xmlns:wpi="http://schemas.microsoft.com/office/word/2010/wordprocessingInk" xmlns:wne="http://schemas.microsoft.com/office/word/2006/wordml" xmlns:wps="http://schemas.microsoft.com/office/word/2010/wordprocessingShape" mc:Ignorable="w14 w15 w16se w16cid w16 w16cex w16sdtdh w16sdtfl w16du wp14">
+<w:document xmlns:wpc="http://schemas.microsoft.com/office/word/2010/wordprocessingCanvas" xmlns:cx="http://schemas.microsoft.com/office/drawing/2014/chartex" xmlns:cx1="http://schemas.microsoft.com/office/drawing/2015/9/8/chartex" xmlns:cx2="http://schemas.microsoft.com/office/drawing/2015/10/21/chartex" xmlns:cx3="http://schemas.microsoft.com/office/drawing/2016/5/9/chartex" xmlns:cx4="http://schemas.microsoft.com/office/drawing/2016/5/10/chartex" xmlns:cx5="http://schemas.microsoft.com/office/drawing/2016/5/11/chartex" xmlns:cx6="http://schemas.microsoft.com/office/drawing/2016/5/12/chartex" xmlns:cx7="http://schemas.microsoft.com/office/drawing/2016/5/13/chartex" xmlns:cx8="http://schemas.microsoft.com/office/drawing/2016/5/14/chartex" xmlns:mc="http://schemas.openxmlformats.org/markup-compatibility/2006" xmlns:aink="http://schemas.microsoft.com/office/drawing/2016/ink" xmlns:am3d="http://schemas.microsoft.com/office/drawing/2017/model3d" xmlns:o="urn:schemas-microsoft-com:office:office" xmlns:oel="http://schemas.microsoft.com/office/2019/extlst" xmlns:r="http://schemas.openxmlformats.org/officeDocument/2006/relationships" xmlns:m="http://schemas.openxmlformats.org/officeDocument/2006/math" xmlns:v="urn:schemas-microsoft-com:vml" xmlns:wp14="http://schemas.microsoft.com/office/word/2010/wordprocessingDrawing" xmlns:wp="http://schemas.openxmlformats.org/drawingml/2006/wordprocessingDrawing" xmlns:w10="urn:schemas-microsoft-com:office:word" xmlns:w="http://schemas.openxmlformats.org/wordprocessingml/2006/main" xmlns:w14="http://schemas.microsoft.com/office/word/2010/wordml" xmlns:w15="http://schemas.microsoft.com/office/word/2012/wordml" xmlns:w16cei="http://schemas.microsoft.com/office/word/2026/wordml/cei" xmlns:w16cex="http://schemas.microsoft.com/office/word/2018/wordml/cex" xmlns:w16cid="http://schemas.microsoft.com/office/word/2016/wordml/cid" xmlns:w16="http://schemas.microsoft.com/office/word/2018/wordml" xmlns:w16du="http://schemas.microsoft.com/office/word/2023/wordml/word16du" xmlns:w16sdtdh="http://schemas.microsoft.com/office/word/2020/wordml/sdtdatahash" xmlns:w16sdtfl="http://schemas.microsoft.com/office/word/2024/wordml/sdtformatlock" xmlns:w16se="http://schemas.microsoft.com/office/word/2015/wordml/symex" xmlns:wpg="http://schemas.microsoft.com/office/word/2010/wordprocessingGroup" xmlns:wpi="http://schemas.microsoft.com/office/word/2010/wordprocessingInk" xmlns:wne="http://schemas.microsoft.com/office/word/2006/wordml" xmlns:wps="http://schemas.microsoft.com/office/word/2010/wordprocessingShape" mc:Ignorable="w14 w15 w16se w16cid w16 w16cex w16sdtdh w16sdtfl w16du wp14">
   <w:body>
     <w:p>
       <w:pPr>
@@ -38,7 +38,7 @@
     <w:tbl>
       <w:tblPr>
         <w:tblW w:w="10064" w:type="dxa"/>
-        <w:tblInd w:w="-289" w:type="dxa"/>
+        <w:jc w:val="center"/>
         <w:tblBorders>
           <w:top w:val="single" w:sz="4" w:space="0" w:color="auto"/>
           <w:left w:val="single" w:sz="4" w:space="0" w:color="auto"/>
@@ -56,6 +56,9 @@
         <w:gridCol w:w="4819"/>
       </w:tblGrid>
       <w:tr>
+        <w:trPr>
+          <w:jc w:val="center"/>
+        </w:trPr>
         <w:tc>
           <w:tcPr>
             <w:tcW w:w="4819" w:type="dxa"/>
@@ -165,6 +168,7 @@
       <w:tr>
         <w:trPr>
           <w:trHeight w:hRule="exact" w:val="3686"/>
+          <w:jc w:val="center"/>
         </w:trPr>
         <w:tc>
           <w:tcPr>
@@ -252,6 +256,9 @@
         </w:tc>
       </w:tr>
       <w:tr>
+        <w:trPr>
+          <w:jc w:val="center"/>
+        </w:trPr>
         <w:tc>
           <w:tcPr>
             <w:tcW w:w="4819" w:type="dxa"/>
@@ -318,6 +325,9 @@
         </w:tc>
       </w:tr>
       <w:tr>
+        <w:trPr>
+          <w:jc w:val="center"/>
+        </w:trPr>
         <w:tc>
           <w:tcPr>
             <w:tcW w:w="4819" w:type="dxa"/>
@@ -429,6 +439,7 @@
       <w:tr>
         <w:trPr>
           <w:trHeight w:hRule="exact" w:val="3686"/>
+          <w:jc w:val="center"/>
         </w:trPr>
         <w:tc>
           <w:tcPr>
@@ -516,6 +527,9 @@
         </w:tc>
       </w:tr>
       <w:tr>
+        <w:trPr>
+          <w:jc w:val="center"/>
+        </w:trPr>
         <w:tc>
           <w:tcPr>
             <w:tcW w:w="4819" w:type="dxa"/>
@@ -582,6 +596,9 @@
         </w:tc>
       </w:tr>
       <w:tr>
+        <w:trPr>
+          <w:jc w:val="center"/>
+        </w:trPr>
         <w:tc>
           <w:tcPr>
             <w:tcW w:w="4819" w:type="dxa"/>
@@ -694,6 +711,7 @@
       <w:tr>
         <w:trPr>
           <w:trHeight w:hRule="exact" w:val="3686"/>
+          <w:jc w:val="center"/>
         </w:trPr>
         <w:tc>
           <w:tcPr>
@@ -796,7 +814,7 @@
 </file>
 
 <file path=word/numbering.xml><?xml version="1.0" encoding="utf-8"?>
-<w:numbering xmlns:wpc="http://schemas.microsoft.com/office/word/2010/wordprocessingCanvas" xmlns:cx="http://schemas.microsoft.com/office/drawing/2014/chartex" xmlns:cx1="http://schemas.microsoft.com/office/drawing/2015/9/8/chartex" xmlns:cx2="http://schemas.microsoft.com/office/drawing/2015/10/21/chartex" xmlns:cx3="http://schemas.microsoft.com/office/drawing/2016/5/9/chartex" xmlns:cx4="http://schemas.microsoft.com/office/drawing/2016/5/10/chartex" xmlns:cx5="http://schemas.microsoft.com/office/drawing/2016/5/11/chartex" xmlns:cx6="http://schemas.microsoft.com/office/drawing/2016/5/12/chartex" xmlns:cx7="http://schemas.microsoft.com/office/drawing/2016/5/13/chartex" xmlns:cx8="http://schemas.microsoft.com/office/drawing/2016/5/14/chartex" xmlns:mc="http://schemas.openxmlformats.org/markup-compatibility/2006" xmlns:aink="http://schemas.microsoft.com/office/drawing/2016/ink" xmlns:am3d="http://schemas.microsoft.com/office/drawing/2017/model3d" xmlns:o="urn:schemas-microsoft-com:office:office" xmlns:oel="http://schemas.microsoft.com/office/2019/extlst" xmlns:r="http://schemas.openxmlformats.org/officeDocument/2006/relationships" xmlns:m="http://schemas.openxmlformats.org/officeDocument/2006/math" xmlns:v="urn:schemas-microsoft-com:vml" xmlns:wp14="http://schemas.microsoft.com/office/word/2010/wordprocessingDrawing" xmlns:wp="http://schemas.openxmlformats.org/drawingml/2006/wordprocessingDrawing" xmlns:w10="urn:schemas-microsoft-com:office:word" xmlns:w="http://schemas.openxmlformats.org/wordprocessingml/2006/main" xmlns:w14="http://schemas.microsoft.com/office/word/2010/wordml" xmlns:w15="http://schemas.microsoft.com/office/word/2012/wordml" xmlns:w16cex="http://schemas.microsoft.com/office/word/2018/wordml/cex" xmlns:w16cid="http://schemas.microsoft.com/office/word/2016/wordml/cid" xmlns:w16="http://schemas.microsoft.com/office/word/2018/wordml" xmlns:w16du="http://schemas.microsoft.com/office/word/2023/wordml/word16du" xmlns:w16sdtdh="http://schemas.microsoft.com/office/word/2020/wordml/sdtdatahash" xmlns:w16sdtfl="http://schemas.microsoft.com/office/word/2024/wordml/sdtformatlock" xmlns:w16se="http://schemas.microsoft.com/office/word/2015/wordml/symex" xmlns:wpg="http://schemas.microsoft.com/office/word/2010/wordprocessingGroup" xmlns:wpi="http://schemas.microsoft.com/office/word/2010/wordprocessingInk" xmlns:wne="http://schemas.microsoft.com/office/word/2006/wordml" xmlns:wps="http://schemas.microsoft.com/office/word/2010/wordprocessingShape" mc:Ignorable="w14 w15 w16se w16cid w16 w16cex w16sdtdh w16sdtfl w16du wp14">
+<w:numbering xmlns:wpc="http://schemas.microsoft.com/office/word/2010/wordprocessingCanvas" xmlns:cx="http://schemas.microsoft.com/office/drawing/2014/chartex" xmlns:cx1="http://schemas.microsoft.com/office/drawing/2015/9/8/chartex" xmlns:cx2="http://schemas.microsoft.com/office/drawing/2015/10/21/chartex" xmlns:cx3="http://schemas.microsoft.com/office/drawing/2016/5/9/chartex" xmlns:cx4="http://schemas.microsoft.com/office/drawing/2016/5/10/chartex" xmlns:cx5="http://schemas.microsoft.com/office/drawing/2016/5/11/chartex" xmlns:cx6="http://schemas.microsoft.com/office/drawing/2016/5/12/chartex" xmlns:cx7="http://schemas.microsoft.com/office/drawing/2016/5/13/chartex" xmlns:cx8="http://schemas.microsoft.com/office/drawing/2016/5/14/chartex" xmlns:mc="http://schemas.openxmlformats.org/markup-compatibility/2006" xmlns:aink="http://schemas.microsoft.com/office/drawing/2016/ink" xmlns:am3d="http://schemas.microsoft.com/office/drawing/2017/model3d" xmlns:o="urn:schemas-microsoft-com:office:office" xmlns:oel="http://schemas.microsoft.com/office/2019/extlst" xmlns:r="http://schemas.openxmlformats.org/officeDocument/2006/relationships" xmlns:m="http://schemas.openxmlformats.org/officeDocument/2006/math" xmlns:v="urn:schemas-microsoft-com:vml" xmlns:wp14="http://schemas.microsoft.com/office/word/2010/wordprocessingDrawing" xmlns:wp="http://schemas.openxmlformats.org/drawingml/2006/wordprocessingDrawing" xmlns:w10="urn:schemas-microsoft-com:office:word" xmlns:w="http://schemas.openxmlformats.org/wordprocessingml/2006/main" xmlns:w14="http://schemas.microsoft.com/office/word/2010/wordml" xmlns:w15="http://schemas.microsoft.com/office/word/2012/wordml" xmlns:w16cei="http://schemas.microsoft.com/office/word/2026/wordml/cei" xmlns:w16cex="http://schemas.microsoft.com/office/word/2018/wordml/cex" xmlns:w16cid="http://schemas.microsoft.com/office/word/2016/wordml/cid" xmlns:w16="http://schemas.microsoft.com/office/word/2018/wordml" xmlns:w16du="http://schemas.microsoft.com/office/word/2023/wordml/word16du" xmlns:w16sdtdh="http://schemas.microsoft.com/office/word/2020/wordml/sdtdatahash" xmlns:w16sdtfl="http://schemas.microsoft.com/office/word/2024/wordml/sdtformatlock" xmlns:w16se="http://schemas.microsoft.com/office/word/2015/wordml/symex" xmlns:wpg="http://schemas.microsoft.com/office/word/2010/wordprocessingGroup" xmlns:wpi="http://schemas.microsoft.com/office/word/2010/wordprocessingInk" xmlns:wne="http://schemas.microsoft.com/office/word/2006/wordml" xmlns:wps="http://schemas.microsoft.com/office/word/2010/wordprocessingShape" mc:Ignorable="w14 w15 w16se w16cid w16 w16cex w16sdtdh w16sdtfl w16du wp14">
   <w:abstractNum w:abstractNumId="0" w15:restartNumberingAfterBreak="0">
     <w:nsid w:val="3B056B8E"/>
     <w:multiLevelType w:val="hybridMultilevel"/>

</xml_diff>